<commit_message>
test: actualizar laboratorio con diez casos de texto y calculos
</commit_message>
<xml_diff>
--- a/entregables/laboratorio_unitarias/Informe_pruebas_unitarias_HateDetect.docx
+++ b/entregables/laboratorio_unitarias/Informe_pruebas_unitarias_HateDetect.docx
@@ -35,12 +35,12 @@
     </w:p>
     <w:p>
       <w:r>
-        <w:t>Verificamos diez comportamientos unitarios de HateDetect mediante pytest. La ejecución inicial aprobó los diez casos. Al introducir un defecto en una copia aislada, una prueba detectó la selección incorrecta del modelo. Después de restaurar esa copia, los diez casos volvieron a aprobarse. Los archivos originales conservaron sus hashes SHA256.</w:t>
+        <w:t>Verificamos diez comportamientos unitarios mediante entradas de texto y números: limpieza, anonimización, clasificación, conteo, validación y cálculos. La ejecución inicial aprobó los diez casos. Una prueba detectó el cálculo incorrecto del promedio en una copia aislada. Al restaurarla, los diez casos volvieron a aprobarse. Las fuentes originales conservaron sus hashes SHA256.</w:t>
       </w:r>
     </w:p>
     <w:p>
       <w:r>
-        <w:t>La suite completa registró 84 pruebas, 0 fallos y 0 errores. Esta suite combina pruebas unitarias y otras comprobaciones de integración e interfaz; no se presenta su totalidad como pruebas unitarias.</w:t>
+        <w:t>La suite completa registró 103 pruebas, 0 fallos y 0 errores. Esta suite combina pruebas unitarias y otras comprobaciones de integración e interfaz; no se presenta su totalidad como pruebas unitarias.</w:t>
       </w:r>
     </w:p>
     <w:p>
@@ -289,7 +289,7 @@
               <w:rPr>
                 <w:sz w:val="18"/>
               </w:rPr>
-              <w:t>Mutación max a min en select_model</w:t>
+              <w:t>Omitir la división al calcular el tiempo promedio</w:t>
             </w:r>
           </w:p>
         </w:tc>
@@ -305,7 +305,7 @@
     </w:p>
     <w:p>
       <w:r>
-        <w:t>Los casos invocan funciones directamente, sin abrir Streamlit, conectar con Reddit ni acceder a una base de datos. Cubren resultados normales, entradas límite, excepciones y una métrica numérica. No miden carga concurrente ni la exactitud del clasificador sobre un corpus real.</w:t>
+        <w:t>Los casos invocan funciones directamente, sin abrir Streamlit, conectar con Reddit ni acceder a una base de datos. PU01 a PU05 utilizan la limpieza y las reglas existentes. PU06 a PU10 utilizan el nuevo módulo reutilizable report_calculations.py, incorporado para estos cálculos y todavía sin conexión a la interfaz. No miden carga concurrente ni exactitud sobre un corpus real.</w:t>
       </w:r>
     </w:p>
     <w:p>
@@ -455,7 +455,7 @@
               <w:rPr>
                 <w:sz w:val="18"/>
               </w:rPr>
-              <w:t>P01</w:t>
+              <w:t>PU01</w:t>
             </w:r>
           </w:p>
         </w:tc>
@@ -471,7 +471,7 @@
               <w:rPr>
                 <w:sz w:val="18"/>
               </w:rPr>
-              <w:t xml:space="preserve">  Hola\n  mundo  </w:t>
+              <w:t>'  Hola   mundo  '</w:t>
             </w:r>
           </w:p>
         </w:tc>
@@ -540,7 +540,7 @@
               <w:rPr>
                 <w:sz w:val="18"/>
               </w:rPr>
-              <w:t>P02</w:t>
+              <w:t>PU02</w:t>
             </w:r>
           </w:p>
         </w:tc>
@@ -625,7 +625,7 @@
               <w:rPr>
                 <w:sz w:val="18"/>
               </w:rPr>
-              <w:t>P03</w:t>
+              <w:t>PU03</w:t>
             </w:r>
           </w:p>
         </w:tc>
@@ -641,7 +641,7 @@
               <w:rPr>
                 <w:sz w:val="18"/>
               </w:rPr>
-              <w:t>No odio a nadie. Qué alegría.</w:t>
+              <w:t>Llámame al +51 999 123 456</w:t>
             </w:r>
           </w:p>
         </w:tc>
@@ -657,7 +657,7 @@
               <w:rPr>
                 <w:sz w:val="18"/>
               </w:rPr>
-              <w:t>No odio a nadie. Qué alegría.</w:t>
+              <w:t>Llámame al [PHONE]</w:t>
             </w:r>
           </w:p>
         </w:tc>
@@ -673,7 +673,7 @@
               <w:rPr>
                 <w:sz w:val="18"/>
               </w:rPr>
-              <w:t>No odio a nadie. Qué alegría.</w:t>
+              <w:t>Llámame al [PHONE]</w:t>
             </w:r>
           </w:p>
         </w:tc>
@@ -710,7 +710,7 @@
               <w:rPr>
                 <w:sz w:val="18"/>
               </w:rPr>
-              <w:t>P04</w:t>
+              <w:t>PU04</w:t>
             </w:r>
           </w:p>
         </w:tc>
@@ -726,7 +726,7 @@
               <w:rPr>
                 <w:sz w:val="18"/>
               </w:rPr>
-              <w:t>None</w:t>
+              <w:t>12345</w:t>
             </w:r>
           </w:p>
         </w:tc>
@@ -795,7 +795,7 @@
               <w:rPr>
                 <w:sz w:val="18"/>
               </w:rPr>
-              <w:t>P05</w:t>
+              <w:t>PU05</w:t>
             </w:r>
           </w:p>
         </w:tc>
@@ -811,7 +811,7 @@
               <w:rPr>
                 <w:sz w:val="18"/>
               </w:rPr>
-              <w:t>''</w:t>
+              <w:t>Eres un idiota.</w:t>
             </w:r>
           </w:p>
         </w:tc>
@@ -827,7 +827,7 @@
               <w:rPr>
                 <w:sz w:val="18"/>
               </w:rPr>
-              <w:t>''</w:t>
+              <w:t>Ofensivo</w:t>
             </w:r>
           </w:p>
         </w:tc>
@@ -843,7 +843,7 @@
               <w:rPr>
                 <w:sz w:val="18"/>
               </w:rPr>
-              <w:t>''</w:t>
+              <w:t>Ofensivo</w:t>
             </w:r>
           </w:p>
         </w:tc>
@@ -880,7 +880,7 @@
               <w:rPr>
                 <w:sz w:val="18"/>
               </w:rPr>
-              <w:t>P06</w:t>
+              <w:t>PU06</w:t>
             </w:r>
           </w:p>
         </w:tc>
@@ -896,7 +896,7 @@
               <w:rPr>
                 <w:sz w:val="18"/>
               </w:rPr>
-              <w:t>{'modelo_a': 0.8, 'modelo_b': 0.3}</w:t>
+              <w:t>['Odio', 'Neutro', 'Ofensivo', 'Odio']</w:t>
             </w:r>
           </w:p>
         </w:tc>
@@ -912,7 +912,7 @@
               <w:rPr>
                 <w:sz w:val="18"/>
               </w:rPr>
-              <w:t>modelo_a</w:t>
+              <w:t>{'Odio': 2, 'Ofensivo': 1, 'Neutro': 1}</w:t>
             </w:r>
           </w:p>
         </w:tc>
@@ -928,7 +928,7 @@
               <w:rPr>
                 <w:sz w:val="18"/>
               </w:rPr>
-              <w:t>modelo_a</w:t>
+              <w:t>{'Odio': 2, 'Ofensivo': 1, 'Neutro': 1}</w:t>
             </w:r>
           </w:p>
         </w:tc>
@@ -965,7 +965,7 @@
               <w:rPr>
                 <w:sz w:val="18"/>
               </w:rPr>
-              <w:t>P07</w:t>
+              <w:t>PU07</w:t>
             </w:r>
           </w:p>
         </w:tc>
@@ -981,7 +981,7 @@
               <w:rPr>
                 <w:sz w:val="18"/>
               </w:rPr>
-              <w:t>{}</w:t>
+              <w:t>Odio=3; total=10</w:t>
             </w:r>
           </w:p>
         </w:tc>
@@ -997,7 +997,7 @@
               <w:rPr>
                 <w:sz w:val="18"/>
               </w:rPr>
-              <w:t>ValueError</w:t>
+              <w:t>30 %</w:t>
             </w:r>
           </w:p>
         </w:tc>
@@ -1013,7 +1013,7 @@
               <w:rPr>
                 <w:sz w:val="18"/>
               </w:rPr>
-              <w:t>ValueError</w:t>
+              <w:t>30 %</w:t>
             </w:r>
           </w:p>
         </w:tc>
@@ -1050,7 +1050,7 @@
               <w:rPr>
                 <w:sz w:val="18"/>
               </w:rPr>
-              <w:t>P08</w:t>
+              <w:t>PU08</w:t>
             </w:r>
           </w:p>
         </w:tc>
@@ -1066,7 +1066,7 @@
               <w:rPr>
                 <w:sz w:val="18"/>
               </w:rPr>
-              <w:t>modelo_a: NaN</w:t>
+              <w:t>Violento</w:t>
             </w:r>
           </w:p>
         </w:tc>
@@ -1082,7 +1082,7 @@
               <w:rPr>
                 <w:sz w:val="18"/>
               </w:rPr>
-              <w:t>ValueError</w:t>
+              <w:t>ValueError: Etiqueta inválida</w:t>
             </w:r>
           </w:p>
         </w:tc>
@@ -1098,7 +1098,7 @@
               <w:rPr>
                 <w:sz w:val="18"/>
               </w:rPr>
-              <w:t>ValueError</w:t>
+              <w:t>ValueError: Etiqueta inválida</w:t>
             </w:r>
           </w:p>
         </w:tc>
@@ -1135,7 +1135,7 @@
               <w:rPr>
                 <w:sz w:val="18"/>
               </w:rPr>
-              <w:t>P09</w:t>
+              <w:t>PU09</w:t>
             </w:r>
           </w:p>
         </w:tc>
@@ -1151,7 +1151,7 @@
               <w:rPr>
                 <w:sz w:val="18"/>
               </w:rPr>
-              <w:t>Real: Odio,Odio,Neutro; predicho: Odio,Neutro,Odio</w:t>
+              <w:t>VP=6; FP=2</w:t>
             </w:r>
           </w:p>
         </w:tc>
@@ -1167,7 +1167,7 @@
               <w:rPr>
                 <w:sz w:val="18"/>
               </w:rPr>
-              <w:t>0.5</w:t>
+              <w:t>75 %</w:t>
             </w:r>
           </w:p>
         </w:tc>
@@ -1183,7 +1183,7 @@
               <w:rPr>
                 <w:sz w:val="18"/>
               </w:rPr>
-              <w:t>0.5</w:t>
+              <w:t>75 %</w:t>
             </w:r>
           </w:p>
         </w:tc>
@@ -1220,7 +1220,7 @@
               <w:rPr>
                 <w:sz w:val="18"/>
               </w:rPr>
-              <w:t>P10</w:t>
+              <w:t>PU10</w:t>
             </w:r>
           </w:p>
         </w:tc>
@@ -1236,7 +1236,7 @@
               <w:rPr>
                 <w:sz w:val="18"/>
               </w:rPr>
-              <w:t>Real: Neutro; predicho: Neutro; FNR de Odio</w:t>
+              <w:t>0.20; 0.30; 0.40 segundos</w:t>
             </w:r>
           </w:p>
         </w:tc>
@@ -1252,7 +1252,7 @@
               <w:rPr>
                 <w:sz w:val="18"/>
               </w:rPr>
-              <w:t>None</w:t>
+              <w:t>0.30 segundos</w:t>
             </w:r>
           </w:p>
         </w:tc>
@@ -1268,7 +1268,7 @@
               <w:rPr>
                 <w:sz w:val="18"/>
               </w:rPr>
-              <w:t>None</w:t>
+              <w:t>0.30 segundos</w:t>
             </w:r>
           </w:p>
         </w:tc>
@@ -1300,17 +1300,17 @@
     </w:p>
     <w:p>
       <w:r>
-        <w:t>P01 a P05 verifican la limpieza y conservación del texto, incluido el ocultamiento de un correo ficticio. P06 exige seleccionar la puntuación de validación más alta. P07 y P08 comprueban que las entradas inválidas generen ValueError.</w:t>
+        <w:t>PU01 elimina espacios sobrantes; PU02 y PU03 ocultan un correo y un teléfono ficticios. PU04 comprueba que el número 12345 se trate como una entrada no textual y produzca una cadena vacía. PU05 llama directamente al clasificador de reglas y espera Ofensivo para el insulto indicado.</w:t>
       </w:r>
     </w:p>
     <w:p>
       <w:r>
-        <w:t>P09 verifica FNR = FN / (TP + FN): un falso negativo entre dos ejemplos reales de Odio produce 0,5. Utiliza pytest.approx con tolerancia absoluta de 10⁻⁹. P10 comprueba que, sin ejemplos reales de Odio, su FNR sea None y no un cero que sugiera desempeño perfecto.</w:t>
+        <w:t>PU06 cuenta las tres categorías. PU07 calcula 3 / 10 × 100 = 30 %. PU08 exige ValueError con el mensaje Etiqueta inválida al recibir Violento. PU09 calcula precisión = VP / (VP + FP) × 100: con 6 verdaderos positivos y 2 falsos positivos obtiene 75 %.</w:t>
       </w:r>
     </w:p>
     <w:p>
       <w:r>
-        <w:t>P10 genera una advertencia de scikit-learn por trabajar con una sola clase. La ejecución registra esa advertencia y la prueba pasa; no se oculta ni se confunde con un error.</w:t>
+        <w:t>PU10 calcula (0,20 + 0,30 + 0,40) / 3 = 0,30 segundos. Son tiempos de entrada conocidos; no son latencias medidas del clasificador. Los cálculos usan pytest.approx con tolerancia absoluta de 10⁻⁹. Las validaciones adicionales de límites se ejecutan aparte, en la suite completa.</w:t>
       </w:r>
     </w:p>
     <w:p>
@@ -1629,7 +1629,7 @@
     </w:tbl>
     <w:p>
       <w:r>
-        <w:t>El ejecutor copia data_pipeline.py, experiment.py y los diez casos a una carpeta temporal. Solo allí sustituye la selección del máximo por la del mínimo. La mutación es un defecto didáctico, no un defecto que estuviera presente en producción.</w:t>
+        <w:t>El ejecutor copia los módulos necesarios y los diez casos a una carpeta temporal. Solo allí modifica average_latency en report_calculations.py para devolver la suma sin dividir entre la cantidad de tiempos. La mutación es un defecto didáctico, no un defecto previo del sistema.</w:t>
       </w:r>
     </w:p>
     <w:p>
@@ -1641,14 +1641,14 @@
           <w:rFonts w:ascii="Consolas" w:hAnsi="Consolas"/>
           <w:sz w:val="18"/>
         </w:rPr>
-        <w:t>Correcto: return max(validation_scores, key=validation_scores.get)</w:t>
+        <w:t>Correcto: return fsum(values) / len(values)</w:t>
         <w:br/>
-        <w:t>Defecto:  return min(validation_scores, key=validation_scores.get)</w:t>
+        <w:t>Defecto:  return fsum(values)</w:t>
       </w:r>
     </w:p>
     <w:p>
       <w:r>
-        <w:t>Con modelo_a = 0,80 y modelo_b = 0,30, P06 esperaba modelo_a. La versión alterada devolvió modelo_b y pytest produjo AssertionError. El registro 02_fallo_controlado.txt conserva la traza completa.</w:t>
+        <w:t>Con tiempos de 0,20; 0,30 y 0,40 segundos, PU10 esperaba 0,30. La versión alterada devolvió 0,90 y pytest produjo AssertionError. El registro 02_fallo_controlado.txt conserva la traza completa.</w:t>
       </w:r>
     </w:p>
     <w:p>
@@ -1660,14 +1660,16 @@
           <w:rFonts w:ascii="Consolas" w:hAnsi="Consolas"/>
           <w:sz w:val="18"/>
         </w:rPr>
-        <w:t>E  AssertionError: assert 'modelo_b' == 'modelo_a'</w:t>
+        <w:t>Esperado: 0.30 segundos</w:t>
+        <w:br/>
+        <w:t>Obtenido con el defecto: 0.90 segundos</w:t>
         <w:br/>
         <w:t>1 failed, 9 passed</w:t>
       </w:r>
     </w:p>
     <w:p>
       <w:r>
-        <w:t>La tercera ejecución restauró el contenido original de experiment.py en la copia temporal. P06 volvió a pasar y el resultado final fue de diez casos aprobados. El archivo resumen.json contiene los hashes de las fuentes y fuentes_intactas = true.</w:t>
+        <w:t>La tercera ejecución restauró report_calculations.py en la copia temporal. PU10 volvió a pasar y el resultado final fue de diez casos aprobados. El archivo resumen.json contiene los hashes de las fuentes y fuentes_intactas = true.</w:t>
       </w:r>
     </w:p>
     <w:p>
@@ -1687,15 +1689,14 @@
           <w:rFonts w:ascii="Consolas" w:hAnsi="Consolas"/>
           <w:sz w:val="18"/>
         </w:rPr>
-        <w:t>def test_p06_elige_mayor_validacion(record_property):</w:t>
+        <w:t>actual = average_latency([0.20, 0.30, 0.40])</w:t>
         <w:br/>
-        <w:t xml:space="preserve">    scores = {"modelo_a": 0.80, "modelo_b": 0.30}</w:t>
-        <w:br/>
-        <w:t xml:space="preserve">    actual = select_model(scores)</w:t>
-        <w:br/>
-        <w:t xml:space="preserve">    evidence(record_property, "P06", scores, "modelo_a", actual)</w:t>
-        <w:br/>
-        <w:t xml:space="preserve">    assert actual == "modelo_a"</w:t>
+        <w:t>assert actual == pytest.approx(0.30, rel=0, abs=1e-9)</w:t>
+      </w:r>
+    </w:p>
+    <w:p>
+      <w:r>
+        <w:t>Extracto de PU10. El archivo de pruebas también registra la entrada, el resultado esperado y el observado mediante record_property para incorporarlos al XML.</w:t>
       </w:r>
     </w:p>
     <w:p>
@@ -1971,7 +1972,7 @@
               <w:rPr>
                 <w:sz w:val="18"/>
               </w:rPr>
-              <w:t>Reportes TXT y XML con el fallo P06</w:t>
+              <w:t>Reportes TXT y XML con el fallo PU10</w:t>
             </w:r>
           </w:p>
         </w:tc>
@@ -2045,7 +2046,7 @@
               <w:rPr>
                 <w:sz w:val="18"/>
               </w:rPr>
-              <w:t>Suite completa de 84 pruebas</w:t>
+              <w:t>Suite completa de 103 pruebas</w:t>
             </w:r>
           </w:p>
         </w:tc>

</xml_diff>